<commit_message>
Updated table of contents in report
</commit_message>
<xml_diff>
--- a/lab2/Pcela-Artiom_TI-265_PC_lab2.docx
+++ b/lab2/Pcela-Artiom_TI-265_PC_lab2.docx
@@ -932,12 +932,13 @@
             <w:pStyle w:val="TOC1"/>
             <w:rPr>
               <w:rFonts w:asciiTheme="minorHAnsi" w:eastAsiaTheme="minorEastAsia" w:hAnsiTheme="minorHAnsi" w:cstheme="minorBidi"/>
+              <w:b w:val="0"/>
+              <w:bCs w:val="0"/>
               <w:kern w:val="2"/>
-              <w:lang w:val="ru-MD" w:eastAsia="ru-RU"/>
               <w14:ligatures w14:val="standardContextual"/>
             </w:rPr>
           </w:pPr>
-          <w:hyperlink w:anchor="_Toc239157091" w:history="1">
+          <w:hyperlink w:anchor="_Toc241059543" w:history="1">
             <w:r>
               <w:rPr>
                 <w:rStyle w:val="Hyperlink"/>
@@ -960,7 +961,7 @@
               <w:rPr>
                 <w:webHidden/>
               </w:rPr>
-              <w:instrText xml:space="preserve"> PAGEREF _Toc239157091 \h </w:instrText>
+              <w:instrText xml:space="preserve"> PAGEREF _Toc241059543 \h </w:instrText>
             </w:r>
             <w:r>
               <w:rPr>
@@ -992,16 +993,16 @@
             <w:pStyle w:val="TOC1"/>
             <w:rPr>
               <w:rFonts w:asciiTheme="minorHAnsi" w:eastAsiaTheme="minorEastAsia" w:hAnsiTheme="minorHAnsi" w:cstheme="minorBidi"/>
+              <w:b w:val="0"/>
+              <w:bCs w:val="0"/>
               <w:kern w:val="2"/>
-              <w:lang w:val="ru-MD" w:eastAsia="ru-RU"/>
               <w14:ligatures w14:val="standardContextual"/>
             </w:rPr>
           </w:pPr>
-          <w:hyperlink w:anchor="_Toc239157092" w:history="1">
+          <w:hyperlink w:anchor="_Toc241059544" w:history="1">
             <w:r>
               <w:rPr>
                 <w:rStyle w:val="Hyperlink"/>
-                <w:lang w:val="ru-MD"/>
               </w:rPr>
               <w:t>ВВЕДЕНИЕ</w:t>
             </w:r>
@@ -1021,7 +1022,7 @@
               <w:rPr>
                 <w:webHidden/>
               </w:rPr>
-              <w:instrText xml:space="preserve"> PAGEREF _Toc239157092 \h </w:instrText>
+              <w:instrText xml:space="preserve"> PAGEREF _Toc241059544 \h </w:instrText>
             </w:r>
             <w:r>
               <w:rPr>
@@ -1053,12 +1054,13 @@
             <w:pStyle w:val="TOC1"/>
             <w:rPr>
               <w:rFonts w:asciiTheme="minorHAnsi" w:eastAsiaTheme="minorEastAsia" w:hAnsiTheme="minorHAnsi" w:cstheme="minorBidi"/>
+              <w:b w:val="0"/>
+              <w:bCs w:val="0"/>
               <w:kern w:val="2"/>
-              <w:lang w:val="ru-MD" w:eastAsia="ru-RU"/>
               <w14:ligatures w14:val="standardContextual"/>
             </w:rPr>
           </w:pPr>
-          <w:hyperlink w:anchor="_Toc239157093" w:history="1">
+          <w:hyperlink w:anchor="_Toc241059545" w:history="1">
             <w:r>
               <w:rPr>
                 <w:rStyle w:val="Hyperlink"/>
@@ -1081,7 +1083,7 @@
               <w:rPr>
                 <w:webHidden/>
               </w:rPr>
-              <w:instrText xml:space="preserve"> PAGEREF _Toc239157093 \h </w:instrText>
+              <w:instrText xml:space="preserve"> PAGEREF _Toc241059545 \h </w:instrText>
             </w:r>
             <w:r>
               <w:rPr>
@@ -1113,12 +1115,13 @@
             <w:pStyle w:val="TOC1"/>
             <w:rPr>
               <w:rFonts w:asciiTheme="minorHAnsi" w:eastAsiaTheme="minorEastAsia" w:hAnsiTheme="minorHAnsi" w:cstheme="minorBidi"/>
+              <w:b w:val="0"/>
+              <w:bCs w:val="0"/>
               <w:kern w:val="2"/>
-              <w:lang w:val="ru-MD" w:eastAsia="ru-RU"/>
               <w14:ligatures w14:val="standardContextual"/>
             </w:rPr>
           </w:pPr>
-          <w:hyperlink w:anchor="_Toc239157094" w:history="1">
+          <w:hyperlink w:anchor="_Toc241059546" w:history="1">
             <w:r>
               <w:rPr>
                 <w:rStyle w:val="Hyperlink"/>
@@ -1141,7 +1144,7 @@
               <w:rPr>
                 <w:webHidden/>
               </w:rPr>
-              <w:instrText xml:space="preserve"> PAGEREF _Toc239157094 \h </w:instrText>
+              <w:instrText xml:space="preserve"> PAGEREF _Toc241059546 \h </w:instrText>
             </w:r>
             <w:r>
               <w:rPr>
@@ -1158,7 +1161,7 @@
               <w:rPr>
                 <w:webHidden/>
               </w:rPr>
-              <w:t>4</w:t>
+              <w:t>6</w:t>
             </w:r>
             <w:r>
               <w:rPr>
@@ -1173,12 +1176,13 @@
             <w:pStyle w:val="TOC1"/>
             <w:rPr>
               <w:rFonts w:asciiTheme="minorHAnsi" w:eastAsiaTheme="minorEastAsia" w:hAnsiTheme="minorHAnsi" w:cstheme="minorBidi"/>
+              <w:b w:val="0"/>
+              <w:bCs w:val="0"/>
               <w:kern w:val="2"/>
-              <w:lang w:val="ru-MD" w:eastAsia="ru-RU"/>
               <w14:ligatures w14:val="standardContextual"/>
             </w:rPr>
           </w:pPr>
-          <w:hyperlink w:anchor="_Toc239157095" w:history="1">
+          <w:hyperlink w:anchor="_Toc241059547" w:history="1">
             <w:r>
               <w:rPr>
                 <w:rStyle w:val="Hyperlink"/>
@@ -1201,7 +1205,7 @@
               <w:rPr>
                 <w:webHidden/>
               </w:rPr>
-              <w:instrText xml:space="preserve"> PAGEREF _Toc239157095 \h </w:instrText>
+              <w:instrText xml:space="preserve"> PAGEREF _Toc241059547 \h </w:instrText>
             </w:r>
             <w:r>
               <w:rPr>
@@ -1218,7 +1222,7 @@
               <w:rPr>
                 <w:webHidden/>
               </w:rPr>
-              <w:t>4</w:t>
+              <w:t>7</w:t>
             </w:r>
             <w:r>
               <w:rPr>
@@ -1258,7 +1262,7 @@
         </w:rPr>
         <w:br w:type="page"/>
       </w:r>
-      <w:bookmarkStart w:id="0" w:name="_Toc239157091"/>
+      <w:bookmarkStart w:id="0" w:name="_Toc241059543"/>
       <w:r>
         <w:lastRenderedPageBreak/>
         <w:t>С</w:t>
@@ -1577,10 +1581,12 @@
       <w:pPr>
         <w:pStyle w:val="Heading1"/>
       </w:pPr>
+      <w:bookmarkStart w:id="1" w:name="_Toc241059544"/>
       <w:r>
         <w:lastRenderedPageBreak/>
         <w:t>ВВЕДЕНИЕ</w:t>
       </w:r>
+      <w:bookmarkEnd w:id="1"/>
     </w:p>
     <w:p>
       <w:pPr>
@@ -1633,9 +1639,11 @@
       <w:pPr>
         <w:pStyle w:val="Heading1"/>
       </w:pPr>
+      <w:bookmarkStart w:id="2" w:name="_Toc241059545"/>
       <w:r>
         <w:t>1 АНАЛИЗ РЕАЛИЗОВАННОГО КОДА</w:t>
       </w:r>
+      <w:bookmarkEnd w:id="2"/>
     </w:p>
     <w:p>
       <w:r>
@@ -1890,9 +1898,14 @@
           <w:szCs w:val="24"/>
         </w:rPr>
       </w:pPr>
+      <w:bookmarkStart w:id="3" w:name="_Toc241059546"/>
       <w:r>
         <w:lastRenderedPageBreak/>
-        <w:t xml:space="preserve">2 РЕЗУЛЬТАТЫ ВЫПОЛНЕНИЯ </w:t>
+        <w:t>2 РЕЗУЛЬТАТЫ ВЫПОЛНЕНИЯ</w:t>
+      </w:r>
+      <w:bookmarkEnd w:id="3"/>
+      <w:r>
+        <w:t xml:space="preserve"> </w:t>
       </w:r>
     </w:p>
     <w:p>
@@ -2069,9 +2082,11 @@
           <w:szCs w:val="24"/>
         </w:rPr>
       </w:pPr>
+      <w:bookmarkStart w:id="4" w:name="_Toc241059547"/>
       <w:r>
         <w:t>ЗАКЛЮЧЕНИЕ</w:t>
       </w:r>
+      <w:bookmarkEnd w:id="4"/>
     </w:p>
     <w:p>
       <w:pPr>

</xml_diff>